<commit_message>
feat(lab01): complete laboratory work
</commit_message>
<xml_diff>
--- a/labs/lab01/report/simulation-modeling-lab01-report.docx
+++ b/labs/lab01/report/simulation-modeling-lab01-report.docx
@@ -3029,116 +3029,6 @@
           <w:rStyle w:val="NormalTok"/>
         </w:rPr>
         <w:t xml:space="preserve">(script_name))</w:t>
-      </w:r>
-    </w:p>
-    <w:p>
-      <w:pPr>
-        <w:pStyle w:val="SourceCode"/>
-      </w:pPr>
-      <w:r>
-        <w:rPr>
-          <w:rStyle w:val="VerbatimChar"/>
-        </w:rPr>
-        <w:t xml:space="preserve">Precompiling packages...</w:t>
-      </w:r>
-      <w:r>
-        <w:br/>
-      </w:r>
-      <w:r>
-        <w:rPr>
-          <w:rStyle w:val="VerbatimChar"/>
-        </w:rPr>
-        <w:t xml:space="preserve">   2176.5 ms  ✓ QuartoNotebookWorkerJSONExt (serial)</w:t>
-      </w:r>
-      <w:r>
-        <w:br/>
-      </w:r>
-      <w:r>
-        <w:rPr>
-          <w:rStyle w:val="VerbatimChar"/>
-        </w:rPr>
-        <w:t xml:space="preserve">  1 dependency successfully precompiled in 2 seconds</w:t>
-      </w:r>
-      <w:r>
-        <w:br/>
-      </w:r>
-      <w:r>
-        <w:rPr>
-          <w:rStyle w:val="VerbatimChar"/>
-        </w:rPr>
-        <w:t xml:space="preserve">Precompiling packages...</w:t>
-      </w:r>
-      <w:r>
-        <w:br/>
-      </w:r>
-      <w:r>
-        <w:rPr>
-          <w:rStyle w:val="VerbatimChar"/>
-        </w:rPr>
-        <w:t xml:space="preserve">   2526.3 ms  ✓ QuartoNotebookWorkerPlotsExt (serial)</w:t>
-      </w:r>
-      <w:r>
-        <w:br/>
-      </w:r>
-      <w:r>
-        <w:rPr>
-          <w:rStyle w:val="VerbatimChar"/>
-        </w:rPr>
-        <w:t xml:space="preserve">  1 dependency successfully precompiled in 3 seconds</w:t>
-      </w:r>
-      <w:r>
-        <w:br/>
-      </w:r>
-      <w:r>
-        <w:rPr>
-          <w:rStyle w:val="VerbatimChar"/>
-        </w:rPr>
-        <w:t xml:space="preserve">Precompiling packages...</w:t>
-      </w:r>
-      <w:r>
-        <w:br/>
-      </w:r>
-      <w:r>
-        <w:rPr>
-          <w:rStyle w:val="VerbatimChar"/>
-        </w:rPr>
-        <w:t xml:space="preserve">   1008.7 ms  ✓ QuartoNotebookWorkerTablesExt (serial)</w:t>
-      </w:r>
-      <w:r>
-        <w:br/>
-      </w:r>
-      <w:r>
-        <w:rPr>
-          <w:rStyle w:val="VerbatimChar"/>
-        </w:rPr>
-        <w:t xml:space="preserve">  1 dependency successfully precompiled in 1 seconds</w:t>
-      </w:r>
-      <w:r>
-        <w:br/>
-      </w:r>
-      <w:r>
-        <w:rPr>
-          <w:rStyle w:val="VerbatimChar"/>
-        </w:rPr>
-        <w:t xml:space="preserve">Precompiling packages...</w:t>
-      </w:r>
-      <w:r>
-        <w:br/>
-      </w:r>
-      <w:r>
-        <w:rPr>
-          <w:rStyle w:val="VerbatimChar"/>
-        </w:rPr>
-        <w:t xml:space="preserve">    884.6 ms  ✓ QuartoNotebookWorkerLaTeXStringsExt (serial)</w:t>
-      </w:r>
-      <w:r>
-        <w:br/>
-      </w:r>
-      <w:r>
-        <w:rPr>
-          <w:rStyle w:val="VerbatimChar"/>
-        </w:rPr>
-        <w:t xml:space="preserve">  1 dependency successfully precompiled in 1 seconds</w:t>
       </w:r>
     </w:p>
     <w:p>
@@ -7721,24 +7611,6 @@
       <w:pPr>
         <w:pStyle w:val="SourceCode"/>
       </w:pPr>
-      <w:r>
-        <w:rPr>
-          <w:rStyle w:val="VerbatimChar"/>
-        </w:rPr>
-        <w:t xml:space="preserve">[ Info: File /home/sidiali/work/study/2026-1/2026-1==study--simulation-modeling/2026-1--study--simulation-modeling/labs/lab01/project/data/startup/single/exp_growth_experiment_name=base_experiment_saveat=0.1_α=0.3.jld2 does not exist. Producing it now...</w:t>
-      </w:r>
-      <w:r>
-        <w:br/>
-      </w:r>
-      <w:r>
-        <w:rPr>
-          <w:rStyle w:val="VerbatimChar"/>
-        </w:rPr>
-        <w:t xml:space="preserve">[ Info: File /home/sidiali/work/study/2026-1/2026-1==study--simulation-modeling/2026-1--study--simulation-modeling/labs/lab01/project/data/startup/single/exp_growth_experiment_name=base_experiment_saveat=0.1_α=0.3.jld2 saved.</w:t>
-      </w:r>
-      <w:r>
-        <w:br/>
-      </w:r>
       <w:r>
         <w:br/>
       </w:r>

</xml_diff>